<commit_message>
Adding Task 2 updated file
</commit_message>
<xml_diff>
--- a/week11/CMN224_Task2_Sienna Niggea.docx
+++ b/week11/CMN224_Task2_Sienna Niggea.docx
@@ -154,27 +154,7 @@
           <w:iCs w:val="0"/>
           <w:color w:val="auto"/>
         </w:rPr>
-        <w:t xml:space="preserve">operation in its rural environment with its </w:t>
-      </w:r>
-      <w:proofErr w:type="spellStart"/>
-      <w:r>
-        <w:rPr>
-          <w:rStyle w:val="IntenseEmphasis"/>
-          <w:i w:val="0"/>
-          <w:iCs w:val="0"/>
-          <w:color w:val="auto"/>
-        </w:rPr>
-        <w:t>imited</w:t>
-      </w:r>
-      <w:proofErr w:type="spellEnd"/>
-      <w:r>
-        <w:rPr>
-          <w:rStyle w:val="IntenseEmphasis"/>
-          <w:i w:val="0"/>
-          <w:iCs w:val="0"/>
-          <w:color w:val="auto"/>
-        </w:rPr>
-        <w:t xml:space="preserve"> internet connectivity.</w:t>
+        <w:t>operation in its rural environment with its imited internet connectivity.</w:t>
       </w:r>
     </w:p>
     <w:p>
@@ -276,27 +256,7 @@
           <w:iCs w:val="0"/>
           <w:color w:val="auto"/>
         </w:rPr>
-        <w:t xml:space="preserve">Record </w:t>
-      </w:r>
-      <w:proofErr w:type="gramStart"/>
-      <w:r>
-        <w:rPr>
-          <w:rStyle w:val="SubtleEmphasis"/>
-          <w:i w:val="0"/>
-          <w:iCs w:val="0"/>
-          <w:color w:val="auto"/>
-        </w:rPr>
-        <w:t>produce</w:t>
-      </w:r>
-      <w:proofErr w:type="gramEnd"/>
-      <w:r>
-        <w:rPr>
-          <w:rStyle w:val="SubtleEmphasis"/>
-          <w:i w:val="0"/>
-          <w:iCs w:val="0"/>
-          <w:color w:val="auto"/>
-        </w:rPr>
-        <w:t xml:space="preserve"> deliveries</w:t>
+        <w:t>Record produce deliveries</w:t>
       </w:r>
       <w:r>
         <w:rPr>
@@ -1079,27 +1039,7 @@
           <w:iCs w:val="0"/>
           <w:color w:val="auto"/>
         </w:rPr>
-        <w:t xml:space="preserve">Record </w:t>
-      </w:r>
-      <w:proofErr w:type="gramStart"/>
-      <w:r>
-        <w:rPr>
-          <w:rStyle w:val="SubtleEmphasis"/>
-          <w:i w:val="0"/>
-          <w:iCs w:val="0"/>
-          <w:color w:val="auto"/>
-        </w:rPr>
-        <w:t>produce</w:t>
-      </w:r>
-      <w:proofErr w:type="gramEnd"/>
-      <w:r>
-        <w:rPr>
-          <w:rStyle w:val="SubtleEmphasis"/>
-          <w:i w:val="0"/>
-          <w:iCs w:val="0"/>
-          <w:color w:val="auto"/>
-        </w:rPr>
-        <w:t xml:space="preserve"> deliveries</w:t>
+        <w:t>Record produce deliveries</w:t>
       </w:r>
     </w:p>
     <w:p>
@@ -2516,21 +2456,13 @@
         <w:ind w:left="1440"/>
       </w:pPr>
       <w:r>
-        <w:t xml:space="preserve">The changes to prices, </w:t>
-      </w:r>
-      <w:proofErr w:type="gramStart"/>
-      <w:r>
-        <w:t>it</w:t>
+        <w:t>The changes to prices, it</w:t>
       </w:r>
       <w:r>
         <w:t>’</w:t>
       </w:r>
       <w:r>
-        <w:t>s</w:t>
-      </w:r>
-      <w:proofErr w:type="gramEnd"/>
-      <w:r>
-        <w:t xml:space="preserve"> deductions, and the payment policies all require approval from authorized managemen</w:t>
+        <w:t>s deductions, and the payment policies all require approval from authorized managemen</w:t>
       </w:r>
       <w:r>
         <w:t>t. These access controls must enforce</w:t>
@@ -3068,15 +3000,7 @@
               <w:cnfStyle w:val="000000000000" w:firstRow="0" w:lastRow="0" w:firstColumn="0" w:lastColumn="0" w:oddVBand="0" w:evenVBand="0" w:oddHBand="0" w:evenHBand="0" w:firstRowFirstColumn="0" w:firstRowLastColumn="0" w:lastRowFirstColumn="0" w:lastRowLastColumn="0"/>
             </w:pPr>
             <w:r>
-              <w:t xml:space="preserve">A summary </w:t>
-            </w:r>
-            <w:proofErr w:type="gramStart"/>
-            <w:r>
-              <w:t>or</w:t>
-            </w:r>
-            <w:proofErr w:type="gramEnd"/>
-            <w:r>
-              <w:t xml:space="preserve"> all operational or financial information.</w:t>
+              <w:t>A summary or all operational or financial information.</w:t>
             </w:r>
           </w:p>
         </w:tc>
@@ -8616,15 +8540,7 @@
         <w:t>the eights increment delivery schedule</w:t>
       </w:r>
       <w:r>
-        <w:t xml:space="preserve"> </w:t>
-      </w:r>
-      <w:proofErr w:type="gramStart"/>
-      <w:r>
-        <w:t>and also</w:t>
-      </w:r>
-      <w:proofErr w:type="gramEnd"/>
-      <w:r>
-        <w:t xml:space="preserve"> allows for enough time for testing, the stakeholders feedback, and then the deployment.</w:t>
+        <w:t xml:space="preserve"> and also allows for enough time for testing, the stakeholders feedback, and then the deployment.</w:t>
       </w:r>
       <w:r>
         <w:t xml:space="preserve"> Thus, we would say is a more realistic estimate than the </w:t>
@@ -9202,7 +9118,43 @@
       <w:pPr>
         <w:pStyle w:val="ListParagraph"/>
         <w:ind w:left="1440"/>
-      </w:pPr>
+        <w:rPr>
+          <w:rStyle w:val="IntenseEmphasis"/>
+        </w:rPr>
+      </w:pPr>
+      <w:r>
+        <w:rPr>
+          <w:rStyle w:val="IntenseEmphasis"/>
+        </w:rPr>
+        <w:t>AI Declaration</w:t>
+      </w:r>
+    </w:p>
+    <w:p>
+      <w:pPr>
+        <w:pStyle w:val="ListParagraph"/>
+        <w:ind w:left="1440"/>
+      </w:pPr>
+      <w:r>
+        <w:t xml:space="preserve">Microsoft copilot was used to assist with </w:t>
+      </w:r>
+      <w:r>
+        <w:t>brainstorming and</w:t>
+      </w:r>
+      <w:r>
+        <w:t xml:space="preserve"> especially used to understand lecture notes to calculate the </w:t>
+      </w:r>
+      <w:r>
+        <w:t xml:space="preserve">estimate section. It was also </w:t>
+      </w:r>
+      <w:r>
+        <w:t>used</w:t>
+      </w:r>
+      <w:r>
+        <w:t xml:space="preserve"> to check against the </w:t>
+      </w:r>
+      <w:r>
+        <w:t>criteria and edit the final content.</w:t>
+      </w:r>
     </w:p>
     <w:p>
       <w:pPr>
@@ -9257,6 +9209,21 @@
         <w:t>Reference</w:t>
       </w:r>
     </w:p>
+    <w:p>
+      <w:r>
+        <w:t xml:space="preserve"> </w:t>
+      </w:r>
+      <w:r>
+        <w:t>CMN224</w:t>
+      </w:r>
+      <w:r>
+        <w:t xml:space="preserve"> </w:t>
+      </w:r>
+      <w:r>
+        <w:t>Week 6 Lecture: Estimation and Work Schedules.</w:t>
+      </w:r>
+    </w:p>
+    <w:p/>
     <w:sectPr>
       <w:pgSz w:w="12240" w:h="15840"/>
       <w:pgMar w:top="1440" w:right="1440" w:bottom="1440" w:left="1440" w:header="720" w:footer="720" w:gutter="0"/>

</xml_diff>